<commit_message>
feat(harness): B-19 evaluation/harness.py — end-to-end unattended run
Satisfies FR-21 (CLI unattended), FR-22 (metrics_report with four groups),
FR-23 (per-ticket degrade, no crash). Cites A8/A9/A10/A11.

- One run_id per invocation (Bug 2 discipline).
- Labels read from raw record only — never through Ticket (FR-01 v2 boundary).
- Label-dependent metrics gated on labels_available (hidden-set safe).
- results.jsonl per-ticket + metrics_report.json aggregate.
- --limit and --skip-guardrails for diagnostic runs.
- Adds src/logging_config.py + tests/test_logging_config.py +
  tests/test_model_call_bounds.py for observability + rate-limit envelope.
</commit_message>
<xml_diff>
--- a/workbooks/Stage_2_PRD_Template.docx
+++ b/workbooks/Stage_2_PRD_Template.docx
@@ -2646,7 +2646,7 @@
               <w:rPr>
                 <w:sz w:val="16"/>
               </w:rPr>
-              <w:t>The router SHALL escalate (never auto-respond) any ticket where `labels.must_not_auto_respond=true`, OR classifier confidence &lt; CONFIDENCE_THRESHOLD, OR retrieval returned an empty passage list, OR any guardrail blocked.</w:t>
+              <w:t>The router SHALL escalate (never auto-respond) any ticket where the classified intent is in the never-auto-respond policy set defined by D-07 (compliance_request, security_incident, feature_request, unclear_request), OR classifier confidence &lt; CONFIDENCE_THRESHOLD, OR retrieval returned an empty passage list, OR any blocking guardrail did not pass, OR the decision-log write for an upstream stage failed (decision_logged=False, per D-03b).</w:t>
             </w:r>
           </w:p>
         </w:tc>
@@ -2715,7 +2715,7 @@
               <w:rPr>
                 <w:sz w:val="16"/>
               </w:rPr>
-              <w:t>For each triggering condition, verify with a fixture that the routing action is 'escalate' and the reason names the trigger.</w:t>
+              <w:t>For each triggering condition, verify with a fixture that the routing action is 'escalate' (or 'block' for a guardrail failure) and that the reason names the trigger. The router SHALL NOT read labels.must_not_auto_respond — that field is evaluation ground truth and is not carried on the Ticket (FR-01 v2).</w:t>
             </w:r>
           </w:p>
         </w:tc>
@@ -8525,7 +8525,7 @@
               <w:rPr>
                 <w:sz w:val="17"/>
               </w:rPr>
-              <w:t>Q6 (added 2026-08-31; downgraded 2026-09-02): Should the D-05 confidence threshold be tier-differentiated? Monday's B-07 measured a 7.9pp retrieval hit@3 gap between business (0.870) and enterprise (0.949). B-30 re-measurement 2026-09-02 closed the gap to 1.4pp (business 0.935 vs enterprise 0.949; standard now leads at 0.966). Tier-aware thresholding is no longer urgent. Still worth measuring in the D-05 sweep as one axis alongside urgency and confidence-band calibration, but not as a blocker.</w:t>
+              <w:t>Q6 (added 2026-08-31; downgraded 2026-09-02): ANSWERED 2026-09-04 (B-16 / D-05b): NO — a single threshold for all tiers.</w:t>
             </w:r>
           </w:p>
         </w:tc>
@@ -8591,7 +8591,7 @@
               <w:rPr>
                 <w:sz w:val="17"/>
               </w:rPr>
-              <w:t>Backlog item B-16 (D-05 threshold sweep), Fri 4 Sep. Now lower priority — the measurement may show no meaningful tier signal, in which case the answer is 'no'.</w:t>
+              <w:t>RESOLVED. The B-16 sweep measured auto-respond precision by tier at the selected 0.85 threshold: standard 0.731 (n=42), business 0.778 (n=30), enterprise 0.833 (n=8). The apparent spread rests on an enterprise cell of n=8 where one ticket moves the figure by 12.5 points — a small-sample artefact, not a tier signal. Separately, a tier-differentiated threshold would mean a standard-tier customer needs a higher bar than an enterprise customer with an identical ticket, which NFR-05 constrains and which would need its own justification. Revisit only if a validation set carries ~25+ enterprise tickets. See docs/adr/D-05b-confidence-threshold-measured.md.</w:t>
             </w:r>
           </w:p>
         </w:tc>
@@ -8615,7 +8615,7 @@
               <w:rPr>
                 <w:sz w:val="17"/>
               </w:rPr>
-              <w:t>Q6 (added 2026-08-31): Should the D-05 confidence threshold be tier-differentiated? B-07 measured a 7.9pp retrieval hit@3 gap between business (0.870) and enterprise (0.949) on n=182 tickets. Under a uniform threshold, that becomes a downstream answer-quality gap. NFR-05 v2 now permits tier-differentiation with an answer-quality cap of 10pp within the auto_respond band.</w:t>
+              <w:t>Q6 (added 2026-08-31): ANSWERED 2026-09-04 (B-16 / D-05b): NO — a single threshold for all tiers.</w:t>
             </w:r>
           </w:p>
         </w:tc>
@@ -8681,7 +8681,7 @@
               <w:rPr>
                 <w:sz w:val="17"/>
               </w:rPr>
-              <w:t>Backlog item B-16 (D-05 threshold sweep), Fri 4 Sep (Week 2 gate day).</w:t>
+              <w:t>RESOLVED. The B-16 sweep measured auto-respond precision by tier at the selected 0.85 threshold: standard 0.731 (n=42), business 0.778 (n=30), enterprise 0.833 (n=8). The apparent spread rests on an enterprise cell of n=8 where one ticket moves the figure by 12.5 points — a small-sample artefact, not a tier signal. Separately, a tier-differentiated threshold would mean a standard-tier customer needs a higher bar than an enterprise customer with an identical ticket, which NFR-05 constrains and which would need its own justification. Revisit only if a validation set carries ~25+ enterprise tickets. See docs/adr/D-05b-confidence-threshold-measured.md.</w:t>
             </w:r>
           </w:p>
         </w:tc>

</xml_diff>